<commit_message>
Record AsCollected #2541 v1 URL across P6-M deposit docs and paper.
Replace pending/not-yet-linked stubs with https://ascollected.org/XZ8_TI5 in study record, ResearchBox bingo, LOCK, and rebuilt paper outputs.

Co-authored-by: Cursor <cursoragent@cursor.com>
</commit_message>
<xml_diff>
--- a/docs/papers/p6-m-schedule-topology/paper_outputs/paper.docx
+++ b/docs/papers/p6-m-schedule-topology/paper_outputs/paper.docx
@@ -709,17 +709,51 @@
         </w:r>
       </w:hyperlink>
       <w:r>
-        <w:t xml:space="preserve">); study record</w:t>
-      </w:r>
-      <w:r>
-        <w:t xml:space="preserve"> </w:t>
+        <w:t xml:space="preserve">); ResearchBox #8918 (</w:t>
       </w:r>
       <w:hyperlink r:id="rId10">
         <w:r>
           <w:rPr>
             <w:rStyle w:val="Hyperlink"/>
           </w:rPr>
-          <w:t xml:space="preserve">https://github.com/pageman/nanochat-filipino/tree/main/docs/papers/p6-m-schedule-topology</w:t>
+          <w:t xml:space="preserve">https://researchbox.org/8918</w:t>
+        </w:r>
+      </w:hyperlink>
+      <w:r>
+        <w:t xml:space="preserve">; FOR PEER REVIEW, not Make Public); AsCollected #2541 Version 1 (</w:t>
+      </w:r>
+      <w:hyperlink r:id="rId11">
+        <w:r>
+          <w:rPr>
+            <w:rStyle w:val="Hyperlink"/>
+          </w:rPr>
+          <w:t xml:space="preserve">https://ascollected.org/XZ8_TI5</w:t>
+        </w:r>
+      </w:hyperlink>
+      <w:r>
+        <w:t xml:space="preserve">; project</w:t>
+      </w:r>
+      <w:r>
+        <w:t xml:space="preserve"> </w:t>
+      </w:r>
+      <w:r>
+        <w:rPr>
+          <w:rStyle w:val="VerbatimChar"/>
+        </w:rPr>
+        <w:t xml:space="preserve">NANOCHAT-FILIPINO P6-M</w:t>
+      </w:r>
+      <w:r>
+        <w:t xml:space="preserve">; linked from box #8918); study record</w:t>
+      </w:r>
+      <w:r>
+        <w:t xml:space="preserve"> </w:t>
+      </w:r>
+      <w:hyperlink r:id="rId12">
+        <w:r>
+          <w:rPr>
+            <w:rStyle w:val="Hyperlink"/>
+          </w:rPr>
+          <w:t xml:space="preserve">https://github.com/pageman/nanochat-filipino/tree/main/docs/p6</w:t>
         </w:r>
       </w:hyperlink>
       <w:r>
@@ -768,6 +802,18 @@
         <w:rPr>
           <w:rStyle w:val="VerbatimChar"/>
         </w:rPr>
+        <w:t xml:space="preserve">results/p6/</w:t>
+      </w:r>
+      <w:r>
+        <w:t xml:space="preserve">,</w:t>
+      </w:r>
+      <w:r>
+        <w:t xml:space="preserve"> </w:t>
+      </w:r>
+      <w:r>
+        <w:rPr>
+          <w:rStyle w:val="VerbatimChar"/>
+        </w:rPr>
         <w:t xml:space="preserve">docs/hub/p6-m-schedule-topology/</w:t>
       </w:r>
       <w:r>
@@ -779,7 +825,7 @@
       <w:r>
         <w:t xml:space="preserve"> </w:t>
       </w:r>
-      <w:hyperlink r:id="rId11">
+      <w:hyperlink r:id="rId13">
         <w:r>
           <w:rPr>
             <w:rStyle w:val="Hyperlink"/>
@@ -788,7 +834,24 @@
         </w:r>
       </w:hyperlink>
       <w:r>
-        <w:t xml:space="preserve">; provisional Hub ID</w:t>
+        <w:t xml:space="preserve">; Hub</w:t>
+      </w:r>
+      <w:r>
+        <w:t xml:space="preserve"> </w:t>
+      </w:r>
+      <w:hyperlink r:id="rId14">
+        <w:r>
+          <w:rPr>
+            <w:rStyle w:val="Hyperlink"/>
+          </w:rPr>
+          <w:t xml:space="preserve">https://huggingface.co/pageman/nanochat-filipino-p6-m-schedule-topology</w:t>
+        </w:r>
+      </w:hyperlink>
+      <w:r>
+        <w:t xml:space="preserve"> </w:t>
+      </w:r>
+      <w:r>
+        <w:t xml:space="preserve">(uploaded commit</w:t>
       </w:r>
       <w:r>
         <w:t xml:space="preserve"> </w:t>
@@ -797,13 +860,10 @@
         <w:rPr>
           <w:rStyle w:val="VerbatimChar"/>
         </w:rPr>
-        <w:t xml:space="preserve">pageman/nanochat-filipino-p6-m-schedule-topology</w:t>
-      </w:r>
-      <w:r>
-        <w:t xml:space="preserve"> </w:t>
-      </w:r>
-      <w:r>
-        <w:t xml:space="preserve">(upload deferred). ResearchBox and AsCollected deposit IDs are deferred at Gate W closeout. Run ID:</w:t>
+        <w:t xml:space="preserve">5d3872b0</w:t>
+      </w:r>
+      <w:r>
+        <w:t xml:space="preserve">; topology children technical recreate). Run ID:</w:t>
       </w:r>
       <w:r>
         <w:t xml:space="preserve"> </w:t>
@@ -818,7 +878,7 @@
         <w:t xml:space="preserve">. Manuscript version: v1.0.</w:t>
       </w:r>
     </w:p>
-    <w:bookmarkStart w:id="12" w:name="sec:intro"/>
+    <w:bookmarkStart w:id="15" w:name="sec:intro"/>
     <w:p>
       <w:pPr>
         <w:pStyle w:val="Heading1"/>
@@ -1002,8 +1062,8 @@
         <w:t xml:space="preserve">EN classifications versus M-fine.</w:t>
       </w:r>
     </w:p>
-    <w:bookmarkEnd w:id="12"/>
-    <w:bookmarkStart w:id="13" w:name="sec:related"/>
+    <w:bookmarkEnd w:id="15"/>
+    <w:bookmarkStart w:id="16" w:name="sec:related"/>
     <w:p>
       <w:pPr>
         <w:pStyle w:val="Heading1"/>
@@ -1093,8 +1153,8 @@
         <w:t xml:space="preserve">.</w:t>
       </w:r>
     </w:p>
-    <w:bookmarkEnd w:id="13"/>
-    <w:bookmarkStart w:id="19" w:name="sec:methods"/>
+    <w:bookmarkEnd w:id="16"/>
+    <w:bookmarkStart w:id="22" w:name="sec:methods"/>
     <w:p>
       <w:pPr>
         <w:pStyle w:val="Heading1"/>
@@ -1103,7 +1163,7 @@
         <w:t xml:space="preserve">Methods</w:t>
       </w:r>
     </w:p>
-    <w:bookmarkStart w:id="14" w:name="registration-and-authority"/>
+    <w:bookmarkStart w:id="17" w:name="registration-and-authority"/>
     <w:p>
       <w:pPr>
         <w:pStyle w:val="Heading2"/>
@@ -1280,11 +1340,22 @@
         <w:t xml:space="preserve"> </w:t>
       </w:r>
       <w:r>
-        <w:t xml:space="preserve">this manuscript (v1.0). The study does not amend #306780, #306935, #307342, #307591, or #307836. ResearchBox and Hub uploads were deferred at Gate W; local archive and paper hashes are recorded in the run-card closeout.</w:t>
-      </w:r>
-    </w:p>
-    <w:bookmarkEnd w:id="14"/>
-    <w:bookmarkStart w:id="15" w:name="sources-tokenizer-and-hosts"/>
+        <w:t xml:space="preserve">this manuscript (v1.0). The study does not amend #306780, #306935, #307342, #307591, or #307836. ResearchBox #8918 remains FOR PEER REVIEW and is not made public by this paper. AsCollected #2541 Version 1 (</w:t>
+      </w:r>
+      <w:hyperlink r:id="rId11">
+        <w:r>
+          <w:rPr>
+            <w:rStyle w:val="Hyperlink"/>
+          </w:rPr>
+          <w:t xml:space="preserve">https://ascollected.org/XZ8_TI5</w:t>
+        </w:r>
+      </w:hyperlink>
+      <w:r>
+        <w:t xml:space="preserve">) records public-corpus provenance and is linked from the box. Hub weights were uploaded after Gate W with independent remote re-hash; topology children on Hub are a technical recreate (new SHAs).</w:t>
+      </w:r>
+    </w:p>
+    <w:bookmarkEnd w:id="17"/>
+    <w:bookmarkStart w:id="18" w:name="sources-tokenizer-and-hosts"/>
     <w:p>
       <w:pPr>
         <w:pStyle w:val="Heading2"/>
@@ -1346,8 +1417,8 @@
         <w:t xml:space="preserve">with formula-equivalent hash .</w:t>
       </w:r>
     </w:p>
-    <w:bookmarkEnd w:id="15"/>
-    <w:bookmarkStart w:id="16" w:name="parent-p0-t-and-c0-freeze"/>
+    <w:bookmarkEnd w:id="18"/>
+    <w:bookmarkStart w:id="19" w:name="parent-p0-t-and-c0-freeze"/>
     <w:p>
       <w:pPr>
         <w:pStyle w:val="Heading2"/>
@@ -1396,8 +1467,8 @@
         <w:t xml:space="preserve">=0. C0 SHA-256: . Smoke and d8 checkpoints are not C0.</w:t>
       </w:r>
     </w:p>
-    <w:bookmarkEnd w:id="16"/>
-    <w:bookmarkStart w:id="17" w:name="children-and-fixed-topology-treatments"/>
+    <w:bookmarkEnd w:id="19"/>
+    <w:bookmarkStart w:id="20" w:name="children-and-fixed-topology-treatments"/>
     <w:p>
       <w:pPr>
         <w:pStyle w:val="Heading2"/>
@@ -1915,8 +1986,8 @@
         <w:t xml:space="preserve">English source-content tokens. Mix-manifest SHA-256: .</w:t>
       </w:r>
     </w:p>
-    <w:bookmarkEnd w:id="17"/>
-    <w:bookmarkStart w:id="18" w:name="lockbox-analysis-and-tests"/>
+    <w:bookmarkEnd w:id="20"/>
+    <w:bookmarkStart w:id="21" w:name="lockbox-analysis-and-tests"/>
     <w:p>
       <w:pPr>
         <w:pStyle w:val="Heading2"/>
@@ -2043,9 +2114,9 @@
         <w:t xml:space="preserve">-value, across-seed average, or P5-style recurrence count.</w:t>
       </w:r>
     </w:p>
-    <w:bookmarkEnd w:id="18"/>
-    <w:bookmarkEnd w:id="19"/>
-    <w:bookmarkStart w:id="23" w:name="sec:results"/>
+    <w:bookmarkEnd w:id="21"/>
+    <w:bookmarkEnd w:id="22"/>
+    <w:bookmarkStart w:id="26" w:name="sec:results"/>
     <w:p>
       <w:pPr>
         <w:pStyle w:val="Heading1"/>
@@ -2184,7 +2255,7 @@
         <w:t xml:space="preserve">for the four mixed topologies.</w:t>
       </w:r>
     </w:p>
-    <w:bookmarkStart w:id="20" w:name="tab:cells"/>
+    <w:bookmarkStart w:id="23" w:name="tab:cells"/>
     <w:p>
       <w:pPr>
         <w:pStyle w:val="TableCaption"/>
@@ -2578,9 +2649,9 @@
         </w:tc>
       </w:tr>
     </w:tbl>
-    <w:bookmarkEnd w:id="20"/>
+    <w:bookmarkEnd w:id="23"/>
     <w:p/>
-    <w:bookmarkStart w:id="21" w:name="tab:primary"/>
+    <w:bookmarkStart w:id="24" w:name="tab:primary"/>
     <w:p>
       <w:pPr>
         <w:pStyle w:val="TableCaption"/>
@@ -3086,9 +3157,9 @@
         </w:tc>
       </w:tr>
     </w:tbl>
-    <w:bookmarkEnd w:id="21"/>
+    <w:bookmarkEnd w:id="24"/>
     <w:p/>
-    <w:bookmarkStart w:id="22" w:name="tab:contextual"/>
+    <w:bookmarkStart w:id="25" w:name="tab:contextual"/>
     <w:p>
       <w:pPr>
         <w:pStyle w:val="TableCaption"/>
@@ -3670,7 +3741,7 @@
         </w:tc>
       </w:tr>
     </w:tbl>
-    <w:bookmarkEnd w:id="22"/>
+    <w:bookmarkEnd w:id="25"/>
     <w:p>
       <w:pPr>
         <w:pStyle w:val="BodyText"/>
@@ -3751,8 +3822,8 @@
         <w:t xml:space="preserve">. Tests do not alter sealed contrasts and are not co-primary.</w:t>
       </w:r>
     </w:p>
-    <w:bookmarkEnd w:id="23"/>
-    <w:bookmarkStart w:id="24" w:name="sec:disc"/>
+    <w:bookmarkEnd w:id="26"/>
+    <w:bookmarkStart w:id="27" w:name="sec:disc"/>
     <w:p>
       <w:pPr>
         <w:pStyle w:val="Heading1"/>
@@ -3847,8 +3918,8 @@
         <w:t xml:space="preserve">place each mixed arm relative to C2 and C1; they are not a second topology success rule. WikiText-TL-39 remains a Cruz–Cheng resource lineage; P6-M does not extend Cheng catastrophic-forgetting protocols and does not claim downstream Filipino-task or all-Philippine-language benefit.</w:t>
       </w:r>
     </w:p>
-    <w:bookmarkEnd w:id="24"/>
-    <w:bookmarkStart w:id="25" w:name="sec:limit"/>
+    <w:bookmarkEnd w:id="27"/>
+    <w:bookmarkStart w:id="28" w:name="sec:limit"/>
     <w:p>
       <w:pPr>
         <w:pStyle w:val="Heading1"/>
@@ -3865,8 +3936,8 @@
         <w:t xml:space="preserve">One seed; one tokenizer; WikiText-family text only; no chat, SFT, CORE, FilBench, or larger-model transfer. Confirmatory GPU work used a rented NVIDIA A40. Raw test JSONL remains restricted. Hub weight release, if any, must ship C0+C1+C2+topology children together with tokenizer and meta; never overwrite P4/P5 Hub IDs. Document-revisit (P7-M), optimizer-state (P8-M), replay/protection, and tokenizer/transfer studies remain separate filings.</w:t>
       </w:r>
     </w:p>
-    <w:bookmarkEnd w:id="25"/>
-    <w:bookmarkStart w:id="26" w:name="sec:dev"/>
+    <w:bookmarkEnd w:id="28"/>
+    <w:bookmarkStart w:id="29" w:name="sec:dev"/>
     <w:p>
       <w:pPr>
         <w:pStyle w:val="Heading1"/>
@@ -4058,8 +4129,8 @@
         <w:t xml:space="preserve">unique); they were not dropped. Cross-split overlap was 0.</w:t>
       </w:r>
     </w:p>
-    <w:bookmarkEnd w:id="26"/>
-    <w:bookmarkStart w:id="28" w:name="availability"/>
+    <w:bookmarkEnd w:id="29"/>
+    <w:bookmarkStart w:id="31" w:name="availability"/>
     <w:p>
       <w:pPr>
         <w:pStyle w:val="Heading1"/>
@@ -4103,7 +4174,7 @@
       <w:r>
         <w:br/>
       </w:r>
-      <w:hyperlink r:id="rId10">
+      <w:hyperlink r:id="rId30">
         <w:r>
           <w:rPr>
             <w:rStyle w:val="Hyperlink"/>
@@ -4125,7 +4196,7 @@
       <w:r>
         <w:br/>
       </w:r>
-      <w:hyperlink r:id="rId11">
+      <w:hyperlink r:id="rId13">
         <w:r>
           <w:rPr>
             <w:rStyle w:val="Hyperlink"/>
@@ -4205,12 +4276,12 @@
         </w:numPr>
       </w:pPr>
       <w:r>
-        <w:t xml:space="preserve">Weights (Hugging Face Hub): provisional ID</w:t>
+        <w:t xml:space="preserve">Weights (Hugging Face Hub):</w:t>
       </w:r>
       <w:r>
         <w:br/>
       </w:r>
-      <w:hyperlink r:id="rId27">
+      <w:hyperlink r:id="rId14">
         <w:r>
           <w:rPr>
             <w:rStyle w:val="Hyperlink"/>
@@ -4222,7 +4293,19 @@
         <w:br/>
       </w:r>
       <w:r>
-        <w:t xml:space="preserve">(upload deferred at Gate W; never write onto P4/P5 Hub IDs).</w:t>
+        <w:t xml:space="preserve">(uploaded; commit</w:t>
+      </w:r>
+      <w:r>
+        <w:t xml:space="preserve"> </w:t>
+      </w:r>
+      <w:r>
+        <w:rPr>
+          <w:rStyle w:val="VerbatimChar"/>
+        </w:rPr>
+        <w:t xml:space="preserve">5d3872b0</w:t>
+      </w:r>
+      <w:r>
+        <w:t xml:space="preserve">; topology children technical recreate; never write onto P4/P5 Hub IDs).</w:t>
       </w:r>
     </w:p>
     <w:p>
@@ -4233,7 +4316,64 @@
         </w:numPr>
       </w:pPr>
       <w:r>
-        <w:t xml:space="preserve">ResearchBox / AsCollected: deferred at Gate W closeout.</w:t>
+        <w:t xml:space="preserve">ResearchBox #8918:</w:t>
+      </w:r>
+      <w:r>
+        <w:t xml:space="preserve"> </w:t>
+      </w:r>
+      <w:hyperlink r:id="rId10">
+        <w:r>
+          <w:rPr>
+            <w:rStyle w:val="Hyperlink"/>
+          </w:rPr>
+          <w:t xml:space="preserve">https://researchbox.org/8918</w:t>
+        </w:r>
+      </w:hyperlink>
+      <w:r>
+        <w:t xml:space="preserve"> </w:t>
+      </w:r>
+      <w:r>
+        <w:t xml:space="preserve">(FOR PEER REVIEW; not Make Public).</w:t>
+      </w:r>
+    </w:p>
+    <w:p>
+      <w:pPr>
+        <w:numPr>
+          <w:ilvl w:val="0"/>
+          <w:numId w:val="1003"/>
+        </w:numPr>
+      </w:pPr>
+      <w:r>
+        <w:t xml:space="preserve">AsCollected #2541 Version 1:</w:t>
+      </w:r>
+      <w:r>
+        <w:t xml:space="preserve"> </w:t>
+      </w:r>
+      <w:hyperlink r:id="rId11">
+        <w:r>
+          <w:rPr>
+            <w:rStyle w:val="Hyperlink"/>
+          </w:rPr>
+          <w:t xml:space="preserve">https://ascollected.org/XZ8_TI5</w:t>
+        </w:r>
+      </w:hyperlink>
+      <w:r>
+        <w:t xml:space="preserve"> </w:t>
+      </w:r>
+      <w:r>
+        <w:t xml:space="preserve">(project</w:t>
+      </w:r>
+      <w:r>
+        <w:t xml:space="preserve"> </w:t>
+      </w:r>
+      <w:r>
+        <w:rPr>
+          <w:rStyle w:val="VerbatimChar"/>
+        </w:rPr>
+        <w:t xml:space="preserve">NANOCHAT-FILIPINO P6-M</w:t>
+      </w:r>
+      <w:r>
+        <w:t xml:space="preserve">; linked from box #8918).</w:t>
       </w:r>
     </w:p>
     <w:p>
@@ -4241,11 +4381,11 @@
         <w:pStyle w:val="FirstParagraph"/>
       </w:pPr>
       <w:r>
-        <w:t xml:space="preserve">Held-out test text is not redistributed. Host credentials are not published. GitHub holds protocol, receipts, sealed/released JSON, and paper; Hugging Face is reserved for optional weight bundles after independent remote re-hash.</w:t>
-      </w:r>
-    </w:p>
-    <w:bookmarkEnd w:id="28"/>
-    <w:bookmarkStart w:id="29" w:name="ethics"/>
+        <w:t xml:space="preserve">Held-out test text is not redistributed. Host credentials are not published. GitHub holds protocol, receipts, sealed/released JSON, and paper; Hugging Face holds the weight bundle after independent remote re-hash.</w:t>
+      </w:r>
+    </w:p>
+    <w:bookmarkEnd w:id="31"/>
+    <w:bookmarkStart w:id="32" w:name="ethics"/>
     <w:p>
       <w:pPr>
         <w:pStyle w:val="Heading1"/>
@@ -4259,11 +4399,11 @@
         <w:pStyle w:val="FirstParagraph"/>
       </w:pPr>
       <w:r>
-        <w:t xml:space="preserve">Public Wikipedia-derived corpora. No human-subjects experiment. Any future ResearchBox remains passcode-protected for peer review until explicitly made public.</w:t>
-      </w:r>
-    </w:p>
-    <w:bookmarkEnd w:id="29"/>
-    <w:bookmarkStart w:id="30" w:name="acknowledgements"/>
+        <w:t xml:space="preserve">Public Wikipedia-derived corpora. No human-subjects experiment. ResearchBox #8918 remains passcode-protected for peer review until explicitly made public.</w:t>
+      </w:r>
+    </w:p>
+    <w:bookmarkEnd w:id="32"/>
+    <w:bookmarkStart w:id="33" w:name="acknowledgements"/>
     <w:p>
       <w:pPr>
         <w:pStyle w:val="Heading1"/>
@@ -4289,8 +4429,8 @@
         <w:t xml:space="preserve">. Errors remain the author’s.</w:t>
       </w:r>
     </w:p>
-    <w:bookmarkEnd w:id="30"/>
-    <w:bookmarkStart w:id="31" w:name="funding"/>
+    <w:bookmarkEnd w:id="33"/>
+    <w:bookmarkStart w:id="34" w:name="funding"/>
     <w:p>
       <w:pPr>
         <w:pStyle w:val="Heading1"/>
@@ -4307,8 +4447,8 @@
         <w:t xml:space="preserve">No dedicated grant. GPU time (Runpod A40) was paid by the author.</w:t>
       </w:r>
     </w:p>
-    <w:bookmarkEnd w:id="31"/>
-    <w:bookmarkStart w:id="32" w:name="app:hashes"/>
+    <w:bookmarkEnd w:id="34"/>
+    <w:bookmarkStart w:id="35" w:name="app:hashes"/>
     <w:p>
       <w:pPr>
         <w:pStyle w:val="Heading1"/>
@@ -4449,8 +4589,8 @@
         <w:t xml:space="preserve">Released contrasts:</w:t>
       </w:r>
     </w:p>
-    <w:bookmarkEnd w:id="32"/>
-    <w:bookmarkStart w:id="34" w:name="app:split"/>
+    <w:bookmarkEnd w:id="35"/>
+    <w:bookmarkStart w:id="37" w:name="app:split"/>
     <w:p>
       <w:pPr>
         <w:pStyle w:val="Heading1"/>
@@ -4507,7 +4647,7 @@
         <w:t xml:space="preserve"> </w:t>
       </w:r>
       <w:r>
-        <w:t xml:space="preserve">is the optional weight deposit (deferred): C0+C1+C2+topology children plus tokenizer and evaluation JSON. Never a single topology child alone. Never write onto P1.1/P2/P3/P4/P5 Hub IDs. Raw test JSONL, passcodes, SSH keys, optimizer states, and HOST operator cards belong in neither public tree.</w:t>
+        <w:t xml:space="preserve">is the weight deposit: C0+C1+C2+topology children plus tokenizer and evaluation JSON (uploaded; topology children technical recreate). Never a single topology child alone. Never write onto P1.1/P2/P3/P4/P5 Hub IDs. Raw test JSONL, passcodes, SSH keys, optimizer states, and HOST operator cards belong in neither public tree.</w:t>
       </w:r>
     </w:p>
     <w:p>
@@ -4715,7 +4855,7 @@
       <w:r>
         <w:t xml:space="preserve"> </w:t>
       </w:r>
-      <w:hyperlink r:id="rId33">
+      <w:hyperlink r:id="rId36">
         <w:r>
           <w:rPr>
             <w:rStyle w:val="Hyperlink"/>
@@ -5105,7 +5245,7 @@
         <w:t xml:space="preserve">, 2009.</w:t>
       </w:r>
     </w:p>
-    <w:bookmarkEnd w:id="34"/>
+    <w:bookmarkEnd w:id="37"/>
     <w:sectPr>
       <w:footnotePr>
         <w:numRestart w:val="eachSect"/>

</xml_diff>

<commit_message>
Publish P6-M paper v1.1 with deposit URLs and margin-safe TeX.
Cite ResearchBox #8918, AsCollected XZ8_TI5, Hub recreate lineage for the four topology arms, and clear Overfull hbox overflows.

Co-authored-by: Cursor <cursoragent@cursor.com>
</commit_message>
<xml_diff>
--- a/docs/papers/p6-m-schedule-topology/paper_outputs/paper.docx
+++ b/docs/papers/p6-m-schedule-topology/paper_outputs/paper.docx
@@ -7,7 +7,7 @@
         <w:pStyle w:val="Title"/>
       </w:pPr>
       <w:r>
-        <w:t xml:space="preserve">Block Order under a Fixed English–Tagalog Token Budget:</w:t>
+        <w:t xml:space="preserve">Block Order under a Fixed English–Tagalog Token Budget v1.1:</w:t>
       </w:r>
       <w:r>
         <w:br/>
@@ -44,7 +44,7 @@
         <w:pStyle w:val="Date"/>
       </w:pPr>
       <w:r>
-        <w:t xml:space="preserve">25 August 2026</w:t>
+        <w:t xml:space="preserve">26 August 2026</w:t>
       </w:r>
     </w:p>
     <w:p>
@@ -694,11 +694,19 @@
         </w:rPr>
         <w:t xml:space="preserve">Registration and deposits (P6-M):</w:t>
       </w:r>
-      <w:r>
-        <w:t xml:space="preserve"> </w:t>
-      </w:r>
-      <w:r>
-        <w:t xml:space="preserve">AsPredicted #307969 (</w:t>
+    </w:p>
+    <w:p>
+      <w:pPr>
+        <w:numPr>
+          <w:ilvl w:val="0"/>
+          <w:numId w:val="1001"/>
+        </w:numPr>
+      </w:pPr>
+      <w:r>
+        <w:t xml:space="preserve">AsPredicted #307969:</w:t>
+      </w:r>
+      <w:r>
+        <w:t xml:space="preserve"> </w:t>
       </w:r>
       <w:hyperlink r:id="rId9">
         <w:r>
@@ -708,8 +716,16 @@
           <w:t xml:space="preserve">https://aspredicted.org/bk6m9d.pdf</w:t>
         </w:r>
       </w:hyperlink>
-      <w:r>
-        <w:t xml:space="preserve">); ResearchBox #8918 (</w:t>
+    </w:p>
+    <w:p>
+      <w:pPr>
+        <w:numPr>
+          <w:ilvl w:val="0"/>
+          <w:numId w:val="1001"/>
+        </w:numPr>
+      </w:pPr>
+      <w:r>
+        <w:t xml:space="preserve">ResearchBox #8918 (</w:t>
       </w:r>
       <w:hyperlink r:id="rId10">
         <w:r>
@@ -720,7 +736,21 @@
         </w:r>
       </w:hyperlink>
       <w:r>
-        <w:t xml:space="preserve">; FOR PEER REVIEW, not Make Public); AsCollected #2541 Version 1 (</w:t>
+        <w:t xml:space="preserve">; FOR PEER REVIEW, not Make Public)</w:t>
+      </w:r>
+    </w:p>
+    <w:p>
+      <w:pPr>
+        <w:numPr>
+          <w:ilvl w:val="0"/>
+          <w:numId w:val="1001"/>
+        </w:numPr>
+      </w:pPr>
+      <w:r>
+        <w:t xml:space="preserve">AsCollected #2541 Version 1:</w:t>
+      </w:r>
+      <w:r>
+        <w:br/>
       </w:r>
       <w:hyperlink r:id="rId11">
         <w:r>
@@ -731,7 +761,10 @@
         </w:r>
       </w:hyperlink>
       <w:r>
-        <w:t xml:space="preserve">; project</w:t>
+        <w:br/>
+      </w:r>
+      <w:r>
+        <w:t xml:space="preserve">(project</w:t>
       </w:r>
       <w:r>
         <w:t xml:space="preserve"> </w:t>
@@ -743,7 +776,18 @@
         <w:t xml:space="preserve">NANOCHAT-FILIPINO P6-M</w:t>
       </w:r>
       <w:r>
-        <w:t xml:space="preserve">; linked from box #8918); study record</w:t>
+        <w:t xml:space="preserve">; linked from box #8918)</w:t>
+      </w:r>
+    </w:p>
+    <w:p>
+      <w:pPr>
+        <w:numPr>
+          <w:ilvl w:val="0"/>
+          <w:numId w:val="1001"/>
+        </w:numPr>
+      </w:pPr>
+      <w:r>
+        <w:t xml:space="preserve">Study record:</w:t>
       </w:r>
       <w:r>
         <w:t xml:space="preserve"> </w:t>
@@ -756,71 +800,16 @@
           <w:t xml:space="preserve">https://github.com/pageman/nanochat-filipino/tree/main/docs/p6</w:t>
         </w:r>
       </w:hyperlink>
-      <w:r>
-        <w:t xml:space="preserve">; GitHub trees</w:t>
-      </w:r>
-      <w:r>
-        <w:t xml:space="preserve"> </w:t>
-      </w:r>
-      <w:r>
-        <w:rPr>
-          <w:rStyle w:val="VerbatimChar"/>
-        </w:rPr>
-        <w:t xml:space="preserve">scripts/p6/</w:t>
-      </w:r>
-      <w:r>
-        <w:t xml:space="preserve">,</w:t>
-      </w:r>
-      <w:r>
-        <w:t xml:space="preserve"> </w:t>
-      </w:r>
-      <w:r>
-        <w:rPr>
-          <w:rStyle w:val="VerbatimChar"/>
-        </w:rPr>
-        <w:t xml:space="preserve">docs/run-cards/p6/</w:t>
-      </w:r>
-      <w:r>
-        <w:t xml:space="preserve">,</w:t>
-      </w:r>
-      <w:r>
-        <w:t xml:space="preserve"> </w:t>
-      </w:r>
-      <w:r>
-        <w:rPr>
-          <w:rStyle w:val="VerbatimChar"/>
-        </w:rPr>
-        <w:t xml:space="preserve">manifests/p6/</w:t>
-      </w:r>
-      <w:r>
-        <w:t xml:space="preserve">,</w:t>
-      </w:r>
-      <w:r>
-        <w:t xml:space="preserve"> </w:t>
-      </w:r>
-      <w:r>
-        <w:rPr>
-          <w:rStyle w:val="VerbatimChar"/>
-        </w:rPr>
-        <w:t xml:space="preserve">results/p6/</w:t>
-      </w:r>
-      <w:r>
-        <w:t xml:space="preserve">,</w:t>
-      </w:r>
-      <w:r>
-        <w:t xml:space="preserve"> </w:t>
-      </w:r>
-      <w:r>
-        <w:rPr>
-          <w:rStyle w:val="VerbatimChar"/>
-        </w:rPr>
-        <w:t xml:space="preserve">docs/hub/p6-m-schedule-topology/</w:t>
-      </w:r>
-      <w:r>
-        <w:t xml:space="preserve"> </w:t>
-      </w:r>
-      <w:r>
-        <w:t xml:space="preserve">under</w:t>
+    </w:p>
+    <w:p>
+      <w:pPr>
+        <w:numPr>
+          <w:ilvl w:val="0"/>
+          <w:numId w:val="1001"/>
+        </w:numPr>
+      </w:pPr>
+      <w:r>
+        <w:t xml:space="preserve">GitHub trees under</w:t>
       </w:r>
       <w:r>
         <w:t xml:space="preserve"> </w:t>
@@ -834,7 +823,87 @@
         </w:r>
       </w:hyperlink>
       <w:r>
-        <w:t xml:space="preserve">; Hub</w:t>
+        <w:t xml:space="preserve">:</w:t>
+      </w:r>
+      <w:r>
+        <w:br/>
+      </w:r>
+      <w:r>
+        <w:rPr>
+          <w:rStyle w:val="VerbatimChar"/>
+        </w:rPr>
+        <w:t xml:space="preserve">scripts/p6/</w:t>
+      </w:r>
+      <w:r>
+        <w:t xml:space="preserve">,</w:t>
+      </w:r>
+      <w:r>
+        <w:t xml:space="preserve"> </w:t>
+      </w:r>
+      <w:r>
+        <w:rPr>
+          <w:rStyle w:val="VerbatimChar"/>
+        </w:rPr>
+        <w:t xml:space="preserve">docs/papers/p6-m-schedule-topology/</w:t>
+      </w:r>
+      <w:r>
+        <w:t xml:space="preserve">,</w:t>
+      </w:r>
+      <w:r>
+        <w:br/>
+      </w:r>
+      <w:r>
+        <w:rPr>
+          <w:rStyle w:val="VerbatimChar"/>
+        </w:rPr>
+        <w:t xml:space="preserve">docs/run-cards/p6/</w:t>
+      </w:r>
+      <w:r>
+        <w:t xml:space="preserve">,</w:t>
+      </w:r>
+      <w:r>
+        <w:t xml:space="preserve"> </w:t>
+      </w:r>
+      <w:r>
+        <w:rPr>
+          <w:rStyle w:val="VerbatimChar"/>
+        </w:rPr>
+        <w:t xml:space="preserve">manifests/p6/</w:t>
+      </w:r>
+      <w:r>
+        <w:t xml:space="preserve">,</w:t>
+      </w:r>
+      <w:r>
+        <w:t xml:space="preserve"> </w:t>
+      </w:r>
+      <w:r>
+        <w:rPr>
+          <w:rStyle w:val="VerbatimChar"/>
+        </w:rPr>
+        <w:t xml:space="preserve">results/p6/</w:t>
+      </w:r>
+      <w:r>
+        <w:t xml:space="preserve">,</w:t>
+      </w:r>
+      <w:r>
+        <w:br/>
+      </w:r>
+      <w:r>
+        <w:rPr>
+          <w:rStyle w:val="VerbatimChar"/>
+        </w:rPr>
+        <w:t xml:space="preserve">docs/hub/p6-m-schedule-topology/</w:t>
+      </w:r>
+    </w:p>
+    <w:p>
+      <w:pPr>
+        <w:numPr>
+          <w:ilvl w:val="0"/>
+          <w:numId w:val="1001"/>
+        </w:numPr>
+      </w:pPr>
+      <w:r>
+        <w:t xml:space="preserve">Hub:</w:t>
       </w:r>
       <w:r>
         <w:t xml:space="preserve"> </w:t>
@@ -848,7 +917,7 @@
         </w:r>
       </w:hyperlink>
       <w:r>
-        <w:t xml:space="preserve"> </w:t>
+        <w:br/>
       </w:r>
       <w:r>
         <w:t xml:space="preserve">(uploaded commit</w:t>
@@ -863,7 +932,18 @@
         <w:t xml:space="preserve">5d3872b0</w:t>
       </w:r>
       <w:r>
-        <w:t xml:space="preserve">; topology children technical recreate). Run ID:</w:t>
+        <w:t xml:space="preserve">; C0/C1/C2/tokenizer original; four topology children technical recreate)</w:t>
+      </w:r>
+    </w:p>
+    <w:p>
+      <w:pPr>
+        <w:numPr>
+          <w:ilvl w:val="0"/>
+          <w:numId w:val="1001"/>
+        </w:numPr>
+      </w:pPr>
+      <w:r>
+        <w:t xml:space="preserve">Run ID:</w:t>
       </w:r>
       <w:r>
         <w:t xml:space="preserve"> </w:t>
@@ -875,7 +955,7 @@
         <w:t xml:space="preserve">p6-20260824T155226Z-769f807a</w:t>
       </w:r>
       <w:r>
-        <w:t xml:space="preserve">. Manuscript version: v1.0.</w:t>
+        <w:t xml:space="preserve">. Manuscript version: v1.1.</w:t>
       </w:r>
     </w:p>
     <w:bookmarkStart w:id="15" w:name="sec:intro"/>
@@ -1154,7 +1234,7 @@
       </w:r>
     </w:p>
     <w:bookmarkEnd w:id="16"/>
-    <w:bookmarkStart w:id="22" w:name="sec:methods"/>
+    <w:bookmarkStart w:id="31" w:name="sec:methods"/>
     <w:p>
       <w:pPr>
         <w:pStyle w:val="Heading1"/>
@@ -1163,7 +1243,7 @@
         <w:t xml:space="preserve">Methods</w:t>
       </w:r>
     </w:p>
-    <w:bookmarkStart w:id="17" w:name="registration-and-authority"/>
+    <w:bookmarkStart w:id="21" w:name="registration-and-authority"/>
     <w:p>
       <w:pPr>
         <w:pStyle w:val="Heading2"/>
@@ -1187,7 +1267,7 @@
       <w:pPr>
         <w:numPr>
           <w:ilvl w:val="0"/>
-          <w:numId w:val="1001"/>
+          <w:numId w:val="1002"/>
         </w:numPr>
       </w:pPr>
       <w:r>
@@ -1209,7 +1289,7 @@
       <w:pPr>
         <w:numPr>
           <w:ilvl w:val="0"/>
-          <w:numId w:val="1001"/>
+          <w:numId w:val="1002"/>
         </w:numPr>
       </w:pPr>
       <w:r>
@@ -1218,12 +1298,20 @@
       <w:r>
         <w:br/>
       </w:r>
+      <w:hyperlink r:id="rId17">
+        <w:r>
+          <w:rPr>
+            <w:rStyle w:val="Hyperlink"/>
+          </w:rPr>
+          <w:t xml:space="preserve">769f807a00264a996b02c38b83ee2cf6c23c4981e36fb477dfc1959fa918a1e7</w:t>
+        </w:r>
+      </w:hyperlink>
     </w:p>
     <w:p>
       <w:pPr>
         <w:numPr>
           <w:ilvl w:val="0"/>
-          <w:numId w:val="1001"/>
+          <w:numId w:val="1002"/>
         </w:numPr>
       </w:pPr>
       <w:r>
@@ -1232,12 +1320,20 @@
       <w:r>
         <w:br/>
       </w:r>
+      <w:hyperlink r:id="rId18">
+        <w:r>
+          <w:rPr>
+            <w:rStyle w:val="Hyperlink"/>
+          </w:rPr>
+          <w:t xml:space="preserve">df49664809ada69d23dcd2c799e75b30f0fdb9afd7aee12b071ac24ef2f81082</w:t>
+        </w:r>
+      </w:hyperlink>
     </w:p>
     <w:p>
       <w:pPr>
         <w:numPr>
           <w:ilvl w:val="0"/>
-          <w:numId w:val="1001"/>
+          <w:numId w:val="1002"/>
         </w:numPr>
       </w:pPr>
       <w:r>
@@ -1246,12 +1342,20 @@
       <w:r>
         <w:br/>
       </w:r>
+      <w:hyperlink r:id="rId19">
+        <w:r>
+          <w:rPr>
+            <w:rStyle w:val="Hyperlink"/>
+          </w:rPr>
+          <w:t xml:space="preserve">d8a63608608c59d2c4d9882e5346625462056c331094942a8a01d496697a1c79</w:t>
+        </w:r>
+      </w:hyperlink>
     </w:p>
     <w:p>
       <w:pPr>
         <w:numPr>
           <w:ilvl w:val="0"/>
-          <w:numId w:val="1001"/>
+          <w:numId w:val="1002"/>
         </w:numPr>
       </w:pPr>
       <w:r>
@@ -1260,6 +1364,14 @@
       <w:r>
         <w:br/>
       </w:r>
+      <w:hyperlink r:id="rId20">
+        <w:r>
+          <w:rPr>
+            <w:rStyle w:val="Hyperlink"/>
+          </w:rPr>
+          <w:t xml:space="preserve">d1e7d5af7247a572e319ee003b5f4e3da5d1fb1592e5ed9ff6b22eeec15ea606</w:t>
+        </w:r>
+      </w:hyperlink>
     </w:p>
     <w:p>
       <w:pPr>
@@ -1340,7 +1452,7 @@
         <w:t xml:space="preserve"> </w:t>
       </w:r>
       <w:r>
-        <w:t xml:space="preserve">this manuscript (v1.0). The study does not amend #306780, #306935, #307342, #307591, or #307836. ResearchBox #8918 remains FOR PEER REVIEW and is not made public by this paper. AsCollected #2541 Version 1 (</w:t>
+        <w:t xml:space="preserve">this manuscript (v1.1). The study does not amend #306780, #306935, #307342, #307591, or #307836. ResearchBox #8918 remains FOR PEER REVIEW and is not made public by this paper. AsCollected #2541 Version 1 (</w:t>
       </w:r>
       <w:hyperlink r:id="rId11">
         <w:r>
@@ -1351,11 +1463,11 @@
         </w:r>
       </w:hyperlink>
       <w:r>
-        <w:t xml:space="preserve">) records public-corpus provenance and is linked from the box. Hub weights were uploaded after Gate W with independent remote re-hash; topology children on Hub are a technical recreate (new SHAs).</w:t>
-      </w:r>
-    </w:p>
-    <w:bookmarkEnd w:id="17"/>
-    <w:bookmarkStart w:id="18" w:name="sources-tokenizer-and-hosts"/>
+        <w:t xml:space="preserve">) records public-corpus provenance and is linked from the box. Hub weights were uploaded after Gate W with independent remote re-hash; the four topology children on Hub are a technical recreate (new SHAs), while C0, C1, C2, and the tokenizer pair remain the original study artifacts.</w:t>
+      </w:r>
+    </w:p>
+    <w:bookmarkEnd w:id="21"/>
+    <w:bookmarkStart w:id="25" w:name="sources-tokenizer-and-hosts"/>
     <w:p>
       <w:pPr>
         <w:pStyle w:val="Heading2"/>
@@ -1383,6 +1495,17 @@
       <w:r>
         <w:t xml:space="preserve"> </w:t>
       </w:r>
+      <w:hyperlink r:id="rId22">
+        <w:r>
+          <w:rPr>
+            <w:rStyle w:val="Hyperlink"/>
+          </w:rPr>
+          <w:t xml:space="preserve">04436b854e0841025a3dd2b46baaeeea07a7ccc252e9f99a19171306f00bc5a8</w:t>
+        </w:r>
+      </w:hyperlink>
+      <w:r>
+        <w:t xml:space="preserve"> </w:t>
+      </w:r>
       <w:r>
         <w:t xml:space="preserve">and</w:t>
       </w:r>
@@ -1398,6 +1521,14 @@
       <w:r>
         <w:t xml:space="preserve"> </w:t>
       </w:r>
+      <w:hyperlink r:id="rId23">
+        <w:r>
+          <w:rPr>
+            <w:rStyle w:val="Hyperlink"/>
+          </w:rPr>
+          <w:t xml:space="preserve">a5dbc1c88f6292696108263072d77115718cc2d8357f7ad4859adfa517cc2132</w:t>
+        </w:r>
+      </w:hyperlink>
       <w:r>
         <w:t xml:space="preserve">. P1.1–P5 weights were not loaded as parents. Official GPU gates used NVIDIA CUDA A40. Official evaluation used</w:t>
       </w:r>
@@ -1414,11 +1545,25 @@
         <w:t xml:space="preserve"> </w:t>
       </w:r>
       <w:r>
-        <w:t xml:space="preserve">with formula-equivalent hash .</w:t>
-      </w:r>
-    </w:p>
-    <w:bookmarkEnd w:id="18"/>
-    <w:bookmarkStart w:id="19" w:name="parent-p0-t-and-c0-freeze"/>
+        <w:t xml:space="preserve">with formula-equivalent hash</w:t>
+      </w:r>
+      <w:r>
+        <w:t xml:space="preserve"> </w:t>
+      </w:r>
+      <w:hyperlink r:id="rId24">
+        <w:r>
+          <w:rPr>
+            <w:rStyle w:val="Hyperlink"/>
+          </w:rPr>
+          <w:t xml:space="preserve">a22a566b71ac9b768543e052e78576f6b079d5c88066f3ec2f8bfef600e17481</w:t>
+        </w:r>
+      </w:hyperlink>
+      <w:r>
+        <w:t xml:space="preserve">.</w:t>
+      </w:r>
+    </w:p>
+    <w:bookmarkEnd w:id="25"/>
+    <w:bookmarkStart w:id="27" w:name="parent-p0-t-and-c0-freeze"/>
     <w:p>
       <w:pPr>
         <w:pStyle w:val="Heading2"/>
@@ -1464,11 +1609,25 @@
         <w:t xml:space="preserve">additional_train_tokens</w:t>
       </w:r>
       <w:r>
-        <w:t xml:space="preserve">=0. C0 SHA-256: . Smoke and d8 checkpoints are not C0.</w:t>
-      </w:r>
-    </w:p>
-    <w:bookmarkEnd w:id="19"/>
-    <w:bookmarkStart w:id="20" w:name="children-and-fixed-topology-treatments"/>
+        <w:t xml:space="preserve">=0. C0 SHA-256:</w:t>
+      </w:r>
+      <w:r>
+        <w:t xml:space="preserve"> </w:t>
+      </w:r>
+      <w:hyperlink r:id="rId26">
+        <w:r>
+          <w:rPr>
+            <w:rStyle w:val="Hyperlink"/>
+          </w:rPr>
+          <w:t xml:space="preserve">7fbd24de792aa4ee27d841866db2114e0fb45b1fdcaa4edcc9b24582220123c9</w:t>
+        </w:r>
+      </w:hyperlink>
+      <w:r>
+        <w:t xml:space="preserve">. Smoke and d8 checkpoints are not C0.</w:t>
+      </w:r>
+    </w:p>
+    <w:bookmarkEnd w:id="27"/>
+    <w:bookmarkStart w:id="29" w:name="children-and-fixed-topology-treatments"/>
     <w:p>
       <w:pPr>
         <w:pStyle w:val="Heading2"/>
@@ -1505,7 +1664,7 @@
         <w:t xml:space="preserve"> </w:t>
       </w:r>
       <w:r>
-        <w:t xml:space="preserve">steps,</w:t>
+        <w:t xml:space="preserve">steps with</w:t>
       </w:r>
       <w:r>
         <w:t xml:space="preserve"> </w:t>
@@ -1534,7 +1693,10 @@
         </m:r>
       </m:oMath>
       <w:r>
-        <w:t xml:space="preserve">,</w:t>
+        <w:t xml:space="preserve"> </w:t>
+      </w:r>
+      <w:r>
+        <w:t xml:space="preserve">and</w:t>
       </w:r>
       <w:r>
         <w:t xml:space="preserve"> </w:t>
@@ -1617,7 +1779,13 @@
         <w:t xml:space="preserve"> </w:t>
       </w:r>
       <w:r>
-        <w:t xml:space="preserve">tokens, serial R</w:t>
+        <w:t xml:space="preserve">tokens.</w:t>
+      </w:r>
+      <w:r>
+        <w:t xml:space="preserve"> </w:t>
+      </w:r>
+      <w:r>
+        <w:t xml:space="preserve">Launches were serial R</w:t>
       </w:r>
       <m:oMath>
         <m:r>
@@ -1639,7 +1807,7 @@
         </m:r>
       </m:oMath>
       <w:r>
-        <w:t xml:space="preserve">T1–T4,</w:t>
+        <w:t xml:space="preserve">T1–T4 with</w:t>
       </w:r>
       <w:r>
         <w:t xml:space="preserve"> </w:t>
@@ -1671,14 +1839,20 @@
         <w:t xml:space="preserve"> </w:t>
       </w:r>
       <w:r>
-        <w:t xml:space="preserve">the parent peak, warmup 14, terminal checkpoint only. Mixed arms share identical within-language streams and stored no-wrap schedules:</w:t>
+        <w:t xml:space="preserve">the parent peak, warmup 14, and terminal checkpoint only.</w:t>
+      </w:r>
+      <w:r>
+        <w:t xml:space="preserve"> </w:t>
+      </w:r>
+      <w:r>
+        <w:t xml:space="preserve">Mixed arms share identical within-language streams and stored no-wrap schedules:</w:t>
       </w:r>
     </w:p>
     <w:p>
       <w:pPr>
         <w:numPr>
           <w:ilvl w:val="0"/>
-          <w:numId w:val="1002"/>
+          <w:numId w:val="1003"/>
         </w:numPr>
       </w:pPr>
       <w:r>
@@ -1742,7 +1916,7 @@
       <w:pPr>
         <w:numPr>
           <w:ilvl w:val="0"/>
-          <w:numId w:val="1002"/>
+          <w:numId w:val="1003"/>
         </w:numPr>
       </w:pPr>
       <w:r>
@@ -1795,7 +1969,7 @@
       <w:pPr>
         <w:numPr>
           <w:ilvl w:val="0"/>
-          <w:numId w:val="1002"/>
+          <w:numId w:val="1003"/>
         </w:numPr>
       </w:pPr>
       <w:r>
@@ -1816,7 +1990,7 @@
       <w:pPr>
         <w:numPr>
           <w:ilvl w:val="0"/>
-          <w:numId w:val="1002"/>
+          <w:numId w:val="1003"/>
         </w:numPr>
       </w:pPr>
       <w:r>
@@ -1983,11 +2157,25 @@
         <w:t xml:space="preserve"> </w:t>
       </w:r>
       <w:r>
-        <w:t xml:space="preserve">English source-content tokens. Mix-manifest SHA-256: .</w:t>
-      </w:r>
-    </w:p>
-    <w:bookmarkEnd w:id="20"/>
-    <w:bookmarkStart w:id="21" w:name="lockbox-analysis-and-tests"/>
+        <w:t xml:space="preserve">English source-content tokens. Mix-manifest SHA-256:</w:t>
+      </w:r>
+      <w:r>
+        <w:br/>
+      </w:r>
+      <w:hyperlink r:id="rId28">
+        <w:r>
+          <w:rPr>
+            <w:rStyle w:val="Hyperlink"/>
+          </w:rPr>
+          <w:t xml:space="preserve">f203c615266bc8c33c358c1de397715791cae33536a9743c8a6bf8cd543cb107</w:t>
+        </w:r>
+      </w:hyperlink>
+      <w:r>
+        <w:t xml:space="preserve">.</w:t>
+      </w:r>
+    </w:p>
+    <w:bookmarkEnd w:id="29"/>
+    <w:bookmarkStart w:id="30" w:name="lockbox-analysis-and-tests"/>
     <w:p>
       <w:pPr>
         <w:pStyle w:val="Heading2"/>
@@ -2114,9 +2302,9 @@
         <w:t xml:space="preserve">-value, across-seed average, or P5-style recurrence count.</w:t>
       </w:r>
     </w:p>
-    <w:bookmarkEnd w:id="21"/>
-    <w:bookmarkEnd w:id="22"/>
-    <w:bookmarkStart w:id="26" w:name="sec:results"/>
+    <w:bookmarkEnd w:id="30"/>
+    <w:bookmarkEnd w:id="31"/>
+    <w:bookmarkStart w:id="35" w:name="sec:results"/>
     <w:p>
       <w:pPr>
         <w:pStyle w:val="Heading1"/>
@@ -2255,7 +2443,7 @@
         <w:t xml:space="preserve">for the four mixed topologies.</w:t>
       </w:r>
     </w:p>
-    <w:bookmarkStart w:id="23" w:name="tab:cells"/>
+    <w:bookmarkStart w:id="32" w:name="tab:cells"/>
     <w:p>
       <w:pPr>
         <w:pStyle w:val="TableCaption"/>
@@ -2649,9 +2837,9 @@
         </w:tc>
       </w:tr>
     </w:tbl>
-    <w:bookmarkEnd w:id="23"/>
+    <w:bookmarkEnd w:id="32"/>
     <w:p/>
-    <w:bookmarkStart w:id="24" w:name="tab:primary"/>
+    <w:bookmarkStart w:id="33" w:name="tab:primary"/>
     <w:p>
       <w:pPr>
         <w:pStyle w:val="TableCaption"/>
@@ -2783,7 +2971,29 @@
         </m:r>
       </m:oMath>
       <w:r>
-        <w:t xml:space="preserve">. Lower BPB is better.</w:t>
+        <w:t xml:space="preserve">. Lower BPB is better. Class labels: better/worse than M-fine by</w:t>
+      </w:r>
+      <w:r>
+        <w:t xml:space="preserve"> </w:t>
+      </w:r>
+      <m:oMath>
+        <m:r>
+          <m:t>δ</m:t>
+        </m:r>
+      </m:oMath>
+      <w:r>
+        <w:t xml:space="preserve">, or within</w:t>
+      </w:r>
+      <w:r>
+        <w:t xml:space="preserve"> </w:t>
+      </w:r>
+      <m:oMath>
+        <m:r>
+          <m:t>δ</m:t>
+        </m:r>
+      </m:oMath>
+      <w:r>
+        <w:t xml:space="preserve">.</w:t>
       </w:r>
     </w:p>
     <w:tbl>
@@ -2791,7 +3001,7 @@
         <w:tblStyle w:val="Table"/>
         <w:tblW w:type="auto" w:w="0"/>
         <w:tblLook w:firstRow="1" w:lastRow="0" w:firstColumn="0" w:lastColumn="0" w:noHBand="0" w:noVBand="0" w:val="0020"/>
-        <w:tblCaption w:val="Primary contrasts versus M-fine at \delta=0.01. \Delta=\mathrm{BPB}(M\textrm{-}\tau)-\mathrm{BPB}(\textrm{M-fine}). Lower BPB is better."/>
+        <w:tblCaption w:val="Primary contrasts versus M-fine at \delta=0.01. \Delta=\mathrm{BPB}(M\textrm{-}\tau)-\mathrm{BPB}(\textrm{M-fine}). Lower BPB is better. Class labels: better/worse than M-fine by \delta, or within \delta."/>
       </w:tblPr>
       <w:tblGrid>
         <w:gridCol w:w="1584"/>
@@ -2930,7 +3140,7 @@
               <w:jc w:val="center"/>
             </w:pPr>
             <w:r>
-              <w:t xml:space="preserve">better than M-fine by</w:t>
+              <w:t xml:space="preserve">better by</w:t>
             </w:r>
             <w:r>
               <w:t xml:space="preserve"> </w:t>
@@ -2967,7 +3177,7 @@
               <w:jc w:val="center"/>
             </w:pPr>
             <w:r>
-              <w:t xml:space="preserve">worse than M-fine by</w:t>
+              <w:t xml:space="preserve">worse by</w:t>
             </w:r>
             <w:r>
               <w:t xml:space="preserve"> </w:t>
@@ -3018,7 +3228,7 @@
               <w:jc w:val="center"/>
             </w:pPr>
             <w:r>
-              <w:t xml:space="preserve">worse than M-fine by</w:t>
+              <w:t xml:space="preserve">worse by</w:t>
             </w:r>
             <w:r>
               <w:t xml:space="preserve"> </w:t>
@@ -3055,7 +3265,7 @@
               <w:jc w:val="center"/>
             </w:pPr>
             <w:r>
-              <w:t xml:space="preserve">worse than M-fine by</w:t>
+              <w:t xml:space="preserve">worse by</w:t>
             </w:r>
             <w:r>
               <w:t xml:space="preserve"> </w:t>
@@ -3157,9 +3367,9 @@
         </w:tc>
       </w:tr>
     </w:tbl>
-    <w:bookmarkEnd w:id="24"/>
+    <w:bookmarkEnd w:id="33"/>
     <w:p/>
-    <w:bookmarkStart w:id="25" w:name="tab:contextual"/>
+    <w:bookmarkStart w:id="34" w:name="tab:contextual"/>
     <w:p>
       <w:pPr>
         <w:pStyle w:val="TableCaption"/>
@@ -3741,7 +3951,7 @@
         </w:tc>
       </w:tr>
     </w:tbl>
-    <w:bookmarkEnd w:id="25"/>
+    <w:bookmarkEnd w:id="34"/>
     <w:p>
       <w:pPr>
         <w:pStyle w:val="BodyText"/>
@@ -3822,8 +4032,8 @@
         <w:t xml:space="preserve">. Tests do not alter sealed contrasts and are not co-primary.</w:t>
       </w:r>
     </w:p>
-    <w:bookmarkEnd w:id="26"/>
-    <w:bookmarkStart w:id="27" w:name="sec:disc"/>
+    <w:bookmarkEnd w:id="35"/>
+    <w:bookmarkStart w:id="36" w:name="sec:disc"/>
     <w:p>
       <w:pPr>
         <w:pStyle w:val="Heading1"/>
@@ -3918,8 +4128,8 @@
         <w:t xml:space="preserve">place each mixed arm relative to C2 and C1; they are not a second topology success rule. WikiText-TL-39 remains a Cruz–Cheng resource lineage; P6-M does not extend Cheng catastrophic-forgetting protocols and does not claim downstream Filipino-task or all-Philippine-language benefit.</w:t>
       </w:r>
     </w:p>
-    <w:bookmarkEnd w:id="27"/>
-    <w:bookmarkStart w:id="28" w:name="sec:limit"/>
+    <w:bookmarkEnd w:id="36"/>
+    <w:bookmarkStart w:id="37" w:name="sec:limit"/>
     <w:p>
       <w:pPr>
         <w:pStyle w:val="Heading1"/>
@@ -3933,11 +4143,11 @@
         <w:pStyle w:val="FirstParagraph"/>
       </w:pPr>
       <w:r>
-        <w:t xml:space="preserve">One seed; one tokenizer; WikiText-family text only; no chat, SFT, CORE, FilBench, or larger-model transfer. Confirmatory GPU work used a rented NVIDIA A40. Raw test JSONL remains restricted. Hub weight release, if any, must ship C0+C1+C2+topology children together with tokenizer and meta; never overwrite P4/P5 Hub IDs. Document-revisit (P7-M), optimizer-state (P8-M), replay/protection, and tokenizer/transfer studies remain separate filings.</w:t>
-      </w:r>
-    </w:p>
-    <w:bookmarkEnd w:id="28"/>
-    <w:bookmarkStart w:id="29" w:name="sec:dev"/>
+        <w:t xml:space="preserve">One seed; one tokenizer; WikiText-family text only; no chat, SFT, CORE, FilBench, or larger-model transfer. Confirmatory GPU work used a rented NVIDIA A40. Raw test JSONL remains restricted. Hub weights ship C0+C1+C2+all four topology children together with tokenizer and meta; never overwrite P4/P5 Hub IDs. The Hub topology children are a post-loss technical recreate and are not bitwise identical to the original Gate T terminals that produced the sealed BPB table. Document-revisit (P7-M), optimizer-state (P8-M), replay/protection, and tokenizer/transfer studies remain separate filings.</w:t>
+      </w:r>
+    </w:p>
+    <w:bookmarkEnd w:id="37"/>
+    <w:bookmarkStart w:id="38" w:name="sec:dev"/>
     <w:p>
       <w:pPr>
         <w:pStyle w:val="Heading1"/>
@@ -4126,11 +4336,11 @@
         <w:t xml:space="preserve"> </w:t>
       </w:r>
       <w:r>
-        <w:t xml:space="preserve">unique); they were not dropped. Cross-split overlap was 0.</w:t>
-      </w:r>
-    </w:p>
-    <w:bookmarkEnd w:id="29"/>
-    <w:bookmarkStart w:id="31" w:name="availability"/>
+        <w:t xml:space="preserve">unique); they were not dropped. Cross-split overlap was 0. After Gate W, original Gate T topology terminals were lost from the sticky study volume; under separate authorization, M-fine/M-coarse/M-blocked/M-rand were technically recreated for Hub deposit only (new SHAs). Science claims remain Gate X / filed Gate T receipts.</w:t>
+      </w:r>
+    </w:p>
+    <w:bookmarkEnd w:id="38"/>
+    <w:bookmarkStart w:id="40" w:name="availability"/>
     <w:p>
       <w:pPr>
         <w:pStyle w:val="Heading1"/>
@@ -4143,7 +4353,7 @@
       <w:pPr>
         <w:numPr>
           <w:ilvl w:val="0"/>
-          <w:numId w:val="1003"/>
+          <w:numId w:val="1004"/>
         </w:numPr>
       </w:pPr>
       <w:r>
@@ -4165,7 +4375,7 @@
       <w:pPr>
         <w:numPr>
           <w:ilvl w:val="0"/>
-          <w:numId w:val="1003"/>
+          <w:numId w:val="1004"/>
         </w:numPr>
       </w:pPr>
       <w:r>
@@ -4174,7 +4384,24 @@
       <w:r>
         <w:br/>
       </w:r>
-      <w:hyperlink r:id="rId30">
+      <w:hyperlink r:id="rId12">
+        <w:r>
+          <w:rPr>
+            <w:rStyle w:val="Hyperlink"/>
+          </w:rPr>
+          <w:t xml:space="preserve">https://github.com/pageman/nanochat-filipino/tree/main/docs/p6</w:t>
+        </w:r>
+      </w:hyperlink>
+      <w:r>
+        <w:br/>
+      </w:r>
+      <w:r>
+        <w:t xml:space="preserve">Paper tree:</w:t>
+      </w:r>
+      <w:r>
+        <w:t xml:space="preserve"> </w:t>
+      </w:r>
+      <w:hyperlink r:id="rId39">
         <w:r>
           <w:rPr>
             <w:rStyle w:val="Hyperlink"/>
@@ -4187,14 +4414,14 @@
       <w:pPr>
         <w:numPr>
           <w:ilvl w:val="0"/>
-          <w:numId w:val="1003"/>
+          <w:numId w:val="1004"/>
         </w:numPr>
       </w:pPr>
       <w:r>
         <w:t xml:space="preserve">Code and audit trees (GitHub):</w:t>
       </w:r>
       <w:r>
-        <w:br/>
+        <w:t xml:space="preserve"> </w:t>
       </w:r>
       <w:hyperlink r:id="rId13">
         <w:r>
@@ -4235,7 +4462,7 @@
         <w:t xml:space="preserve">,</w:t>
       </w:r>
       <w:r>
-        <w:t xml:space="preserve"> </w:t>
+        <w:br/>
       </w:r>
       <w:r>
         <w:rPr>
@@ -4265,6 +4492,18 @@
         <w:rPr>
           <w:rStyle w:val="VerbatimChar"/>
         </w:rPr>
+        <w:t xml:space="preserve">results/p6/</w:t>
+      </w:r>
+      <w:r>
+        <w:t xml:space="preserve">,</w:t>
+      </w:r>
+      <w:r>
+        <w:br/>
+      </w:r>
+      <w:r>
+        <w:rPr>
+          <w:rStyle w:val="VerbatimChar"/>
+        </w:rPr>
         <w:t xml:space="preserve">docs/hub/p6-m-schedule-topology/</w:t>
       </w:r>
     </w:p>
@@ -4272,7 +4511,7 @@
       <w:pPr>
         <w:numPr>
           <w:ilvl w:val="0"/>
-          <w:numId w:val="1003"/>
+          <w:numId w:val="1004"/>
         </w:numPr>
       </w:pPr>
       <w:r>
@@ -4293,7 +4532,7 @@
         <w:br/>
       </w:r>
       <w:r>
-        <w:t xml:space="preserve">(uploaded; commit</w:t>
+        <w:t xml:space="preserve">Uploaded commit</w:t>
       </w:r>
       <w:r>
         <w:t xml:space="preserve"> </w:t>
@@ -4305,14 +4544,14 @@
         <w:t xml:space="preserve">5d3872b0</w:t>
       </w:r>
       <w:r>
-        <w:t xml:space="preserve">; topology children technical recreate; never write onto P4/P5 Hub IDs).</w:t>
+        <w:t xml:space="preserve">; topology children technical recreate; never write onto P4/P5 Hub IDs.</w:t>
       </w:r>
     </w:p>
     <w:p>
       <w:pPr>
         <w:numPr>
           <w:ilvl w:val="0"/>
-          <w:numId w:val="1003"/>
+          <w:numId w:val="1004"/>
         </w:numPr>
       </w:pPr>
       <w:r>
@@ -4330,7 +4569,7 @@
         </w:r>
       </w:hyperlink>
       <w:r>
-        <w:t xml:space="preserve"> </w:t>
+        <w:br/>
       </w:r>
       <w:r>
         <w:t xml:space="preserve">(FOR PEER REVIEW; not Make Public).</w:t>
@@ -4340,7 +4579,7 @@
       <w:pPr>
         <w:numPr>
           <w:ilvl w:val="0"/>
-          <w:numId w:val="1003"/>
+          <w:numId w:val="1004"/>
         </w:numPr>
       </w:pPr>
       <w:r>
@@ -4358,7 +4597,7 @@
         </w:r>
       </w:hyperlink>
       <w:r>
-        <w:t xml:space="preserve"> </w:t>
+        <w:br/>
       </w:r>
       <w:r>
         <w:t xml:space="preserve">(project</w:t>
@@ -4384,8 +4623,8 @@
         <w:t xml:space="preserve">Held-out test text is not redistributed. Host credentials are not published. GitHub holds protocol, receipts, sealed/released JSON, and paper; Hugging Face holds the weight bundle after independent remote re-hash.</w:t>
       </w:r>
     </w:p>
-    <w:bookmarkEnd w:id="31"/>
-    <w:bookmarkStart w:id="32" w:name="ethics"/>
+    <w:bookmarkEnd w:id="40"/>
+    <w:bookmarkStart w:id="41" w:name="ethics"/>
     <w:p>
       <w:pPr>
         <w:pStyle w:val="Heading1"/>
@@ -4402,8 +4641,8 @@
         <w:t xml:space="preserve">Public Wikipedia-derived corpora. No human-subjects experiment. ResearchBox #8918 remains passcode-protected for peer review until explicitly made public.</w:t>
       </w:r>
     </w:p>
-    <w:bookmarkEnd w:id="32"/>
-    <w:bookmarkStart w:id="33" w:name="acknowledgements"/>
+    <w:bookmarkEnd w:id="41"/>
+    <w:bookmarkStart w:id="42" w:name="acknowledgements"/>
     <w:p>
       <w:pPr>
         <w:pStyle w:val="Heading1"/>
@@ -4429,8 +4668,8 @@
         <w:t xml:space="preserve">. Errors remain the author’s.</w:t>
       </w:r>
     </w:p>
-    <w:bookmarkEnd w:id="33"/>
-    <w:bookmarkStart w:id="34" w:name="funding"/>
+    <w:bookmarkEnd w:id="42"/>
+    <w:bookmarkStart w:id="43" w:name="funding"/>
     <w:p>
       <w:pPr>
         <w:pStyle w:val="Heading1"/>
@@ -4447,8 +4686,8 @@
         <w:t xml:space="preserve">No dedicated grant. GPU time (Runpod A40) was paid by the author.</w:t>
       </w:r>
     </w:p>
-    <w:bookmarkEnd w:id="34"/>
-    <w:bookmarkStart w:id="35" w:name="app:hashes"/>
+    <w:bookmarkEnd w:id="43"/>
+    <w:bookmarkStart w:id="57" w:name="app:hashes"/>
     <w:p>
       <w:pPr>
         <w:pStyle w:val="Heading1"/>
@@ -4461,136 +4700,367 @@
       <w:pPr>
         <w:numPr>
           <w:ilvl w:val="0"/>
-          <w:numId w:val="1004"/>
+          <w:numId w:val="1005"/>
         </w:numPr>
       </w:pPr>
       <w:r>
         <w:t xml:space="preserve">Pin / nanochat:</w:t>
       </w:r>
+      <w:r>
+        <w:br/>
+      </w:r>
+      <w:hyperlink r:id="rId44">
+        <w:r>
+          <w:rPr>
+            <w:rStyle w:val="Hyperlink"/>
+          </w:rPr>
+          <w:t xml:space="preserve">92d63d4e8bb4df75c3b71618f31ddde2378b2bcd</w:t>
+        </w:r>
+      </w:hyperlink>
     </w:p>
     <w:p>
       <w:pPr>
         <w:numPr>
           <w:ilvl w:val="0"/>
-          <w:numId w:val="1004"/>
+          <w:numId w:val="1005"/>
         </w:numPr>
       </w:pPr>
       <w:r>
         <w:t xml:space="preserve">AsPredicted PDF:</w:t>
       </w:r>
+      <w:r>
+        <w:br/>
+      </w:r>
+      <w:hyperlink r:id="rId17">
+        <w:r>
+          <w:rPr>
+            <w:rStyle w:val="Hyperlink"/>
+          </w:rPr>
+          <w:t xml:space="preserve">769f807a00264a996b02c38b83ee2cf6c23c4981e36fb477dfc1959fa918a1e7</w:t>
+        </w:r>
+      </w:hyperlink>
     </w:p>
     <w:p>
       <w:pPr>
         <w:numPr>
           <w:ilvl w:val="0"/>
-          <w:numId w:val="1004"/>
+          <w:numId w:val="1005"/>
         </w:numPr>
       </w:pPr>
       <w:r>
         <w:t xml:space="preserve">Gate plan:</w:t>
       </w:r>
+      <w:r>
+        <w:br/>
+      </w:r>
+      <w:hyperlink r:id="rId19">
+        <w:r>
+          <w:rPr>
+            <w:rStyle w:val="Hyperlink"/>
+          </w:rPr>
+          <w:t xml:space="preserve">d8a63608608c59d2c4d9882e5346625462056c331094942a8a01d496697a1c79</w:t>
+        </w:r>
+      </w:hyperlink>
     </w:p>
     <w:p>
       <w:pPr>
         <w:numPr>
           <w:ilvl w:val="0"/>
-          <w:numId w:val="1004"/>
+          <w:numId w:val="1005"/>
         </w:numPr>
       </w:pPr>
       <w:r>
         <w:t xml:space="preserve">Addendum:</w:t>
       </w:r>
+      <w:r>
+        <w:br/>
+      </w:r>
+      <w:hyperlink r:id="rId18">
+        <w:r>
+          <w:rPr>
+            <w:rStyle w:val="Hyperlink"/>
+          </w:rPr>
+          <w:t xml:space="preserve">df49664809ada69d23dcd2c799e75b30f0fdb9afd7aee12b071ac24ef2f81082</w:t>
+        </w:r>
+      </w:hyperlink>
     </w:p>
     <w:p>
       <w:pPr>
         <w:numPr>
           <w:ilvl w:val="0"/>
-          <w:numId w:val="1004"/>
+          <w:numId w:val="1005"/>
         </w:numPr>
       </w:pPr>
       <w:r>
         <w:t xml:space="preserve">Topology manifest:</w:t>
       </w:r>
+      <w:r>
+        <w:br/>
+      </w:r>
+      <w:hyperlink r:id="rId20">
+        <w:r>
+          <w:rPr>
+            <w:rStyle w:val="Hyperlink"/>
+          </w:rPr>
+          <w:t xml:space="preserve">d1e7d5af7247a572e319ee003b5f4e3da5d1fb1592e5ed9ff6b22eeec15ea606</w:t>
+        </w:r>
+      </w:hyperlink>
     </w:p>
     <w:p>
       <w:pPr>
         <w:numPr>
           <w:ilvl w:val="0"/>
-          <w:numId w:val="1004"/>
+          <w:numId w:val="1005"/>
         </w:numPr>
       </w:pPr>
       <w:r>
         <w:t xml:space="preserve">Mix manifest:</w:t>
       </w:r>
+      <w:r>
+        <w:br/>
+      </w:r>
+      <w:hyperlink r:id="rId28">
+        <w:r>
+          <w:rPr>
+            <w:rStyle w:val="Hyperlink"/>
+          </w:rPr>
+          <w:t xml:space="preserve">f203c615266bc8c33c358c1de397715791cae33536a9743c8a6bf8cd543cb107</w:t>
+        </w:r>
+      </w:hyperlink>
     </w:p>
     <w:p>
       <w:pPr>
         <w:numPr>
           <w:ilvl w:val="0"/>
-          <w:numId w:val="1004"/>
+          <w:numId w:val="1005"/>
         </w:numPr>
       </w:pPr>
       <w:r>
         <w:t xml:space="preserve">Evaluator (P6 path):</w:t>
       </w:r>
+      <w:r>
+        <w:br/>
+      </w:r>
+      <w:hyperlink r:id="rId24">
+        <w:r>
+          <w:rPr>
+            <w:rStyle w:val="Hyperlink"/>
+          </w:rPr>
+          <w:t xml:space="preserve">a22a566b71ac9b768543e052e78576f6b079d5c88066f3ec2f8bfef600e17481</w:t>
+        </w:r>
+      </w:hyperlink>
     </w:p>
     <w:p>
       <w:pPr>
         <w:numPr>
           <w:ilvl w:val="0"/>
-          <w:numId w:val="1004"/>
+          <w:numId w:val="1005"/>
         </w:numPr>
       </w:pPr>
       <w:r>
-        <w:t xml:space="preserve">C0:</w:t>
-      </w:r>
+        <w:t xml:space="preserve">C0 (original / Hub):</w:t>
+      </w:r>
+      <w:r>
+        <w:br/>
+      </w:r>
+      <w:hyperlink r:id="rId26">
+        <w:r>
+          <w:rPr>
+            <w:rStyle w:val="Hyperlink"/>
+          </w:rPr>
+          <w:t xml:space="preserve">7fbd24de792aa4ee27d841866db2114e0fb45b1fdcaa4edcc9b24582220123c9</w:t>
+        </w:r>
+      </w:hyperlink>
     </w:p>
     <w:p>
       <w:pPr>
         <w:numPr>
           <w:ilvl w:val="0"/>
-          <w:numId w:val="1004"/>
+          <w:numId w:val="1005"/>
         </w:numPr>
       </w:pPr>
       <w:r>
-        <w:t xml:space="preserve">C1 / C2: /</w:t>
-      </w:r>
+        <w:t xml:space="preserve">C1 / C2 (original / Hub):</w:t>
+      </w:r>
+      <w:r>
+        <w:br/>
+      </w:r>
+      <w:hyperlink r:id="rId45">
+        <w:r>
+          <w:rPr>
+            <w:rStyle w:val="Hyperlink"/>
+          </w:rPr>
+          <w:t xml:space="preserve">6223c116779ce3128c1e4cae0f2e03744b3068169ad7bb88f75a5146671a99bd</w:t>
+        </w:r>
+      </w:hyperlink>
+      <w:r>
+        <w:br/>
+      </w:r>
+      <w:hyperlink r:id="rId46">
+        <w:r>
+          <w:rPr>
+            <w:rStyle w:val="Hyperlink"/>
+          </w:rPr>
+          <w:t xml:space="preserve">04c06c195e513c7b30752637b80591c29e740879d91c35c323fb75fafca8747d</w:t>
+        </w:r>
+      </w:hyperlink>
     </w:p>
     <w:p>
       <w:pPr>
         <w:numPr>
           <w:ilvl w:val="0"/>
-          <w:numId w:val="1004"/>
+          <w:numId w:val="1005"/>
         </w:numPr>
       </w:pPr>
       <w:r>
-        <w:t xml:space="preserve">M-fine / M-coarse / M-blocked / M-rand: / / /</w:t>
-      </w:r>
+        <w:t xml:space="preserve">M-fine / M-coarse / M-blocked / M-rand (original Gate T; science):</w:t>
+      </w:r>
+      <w:r>
+        <w:br/>
+      </w:r>
+      <w:hyperlink r:id="rId47">
+        <w:r>
+          <w:rPr>
+            <w:rStyle w:val="Hyperlink"/>
+          </w:rPr>
+          <w:t xml:space="preserve">a0139607a8fdf2772d4b8e722b449b6a8db04056a8dc38cd177708af8f15eeab</w:t>
+        </w:r>
+      </w:hyperlink>
+      <w:r>
+        <w:br/>
+      </w:r>
+      <w:hyperlink r:id="rId48">
+        <w:r>
+          <w:rPr>
+            <w:rStyle w:val="Hyperlink"/>
+          </w:rPr>
+          <w:t xml:space="preserve">86588ee9f72ea4a85a821c2c882a363d55d3e50ccb325bdabaa0706e1e911dfe</w:t>
+        </w:r>
+      </w:hyperlink>
+      <w:r>
+        <w:br/>
+      </w:r>
+      <w:hyperlink r:id="rId49">
+        <w:r>
+          <w:rPr>
+            <w:rStyle w:val="Hyperlink"/>
+          </w:rPr>
+          <w:t xml:space="preserve">5ec45216eb0a09b5bc04f04f4622d85f7d8f7ff8861fdea6de5487f7c18fa526</w:t>
+        </w:r>
+      </w:hyperlink>
+      <w:r>
+        <w:br/>
+      </w:r>
+      <w:hyperlink r:id="rId50">
+        <w:r>
+          <w:rPr>
+            <w:rStyle w:val="Hyperlink"/>
+          </w:rPr>
+          <w:t xml:space="preserve">38580cd501c0d87a1a502397697f7c7e427134eb7cb64bdce2ba6be1a036f108</w:t>
+        </w:r>
+      </w:hyperlink>
     </w:p>
     <w:p>
       <w:pPr>
         <w:numPr>
           <w:ilvl w:val="0"/>
-          <w:numId w:val="1004"/>
+          <w:numId w:val="1005"/>
         </w:numPr>
       </w:pPr>
       <w:r>
-        <w:t xml:space="preserve">U seal:</w:t>
-      </w:r>
+        <w:t xml:space="preserve">M-fine / M-coarse / M-blocked / M-rand (Hub technical recreate):</w:t>
+      </w:r>
+      <w:r>
+        <w:br/>
+      </w:r>
+      <w:hyperlink r:id="rId51">
+        <w:r>
+          <w:rPr>
+            <w:rStyle w:val="Hyperlink"/>
+          </w:rPr>
+          <w:t xml:space="preserve">69a5046ee756faba84f0f5e9c6a0f1330f886f9dd0344f02797798d1d2d0bfe7</w:t>
+        </w:r>
+      </w:hyperlink>
+      <w:r>
+        <w:br/>
+      </w:r>
+      <w:hyperlink r:id="rId52">
+        <w:r>
+          <w:rPr>
+            <w:rStyle w:val="Hyperlink"/>
+          </w:rPr>
+          <w:t xml:space="preserve">c09072fe764f1debd9607f697e2aa8484ef394a96d2ef096f05bb1f0d6c518f7</w:t>
+        </w:r>
+      </w:hyperlink>
+      <w:r>
+        <w:br/>
+      </w:r>
+      <w:hyperlink r:id="rId53">
+        <w:r>
+          <w:rPr>
+            <w:rStyle w:val="Hyperlink"/>
+          </w:rPr>
+          <w:t xml:space="preserve">ebfc4853b51cc8c81480ffb57640487d3fe344d38ec51ad5bb1eb7cf159272d2</w:t>
+        </w:r>
+      </w:hyperlink>
+      <w:r>
+        <w:br/>
+      </w:r>
+      <w:hyperlink r:id="rId54">
+        <w:r>
+          <w:rPr>
+            <w:rStyle w:val="Hyperlink"/>
+          </w:rPr>
+          <w:t xml:space="preserve">16f6679310c379ce2403e587620eb0ef7d162d6e92ddfc9589d272915eff981d</w:t>
+        </w:r>
+      </w:hyperlink>
     </w:p>
     <w:p>
       <w:pPr>
         <w:numPr>
           <w:ilvl w:val="0"/>
-          <w:numId w:val="1004"/>
+          <w:numId w:val="1005"/>
         </w:numPr>
       </w:pPr>
       <w:r>
+        <w:t xml:space="preserve">U seal:</w:t>
+      </w:r>
+      <w:r>
+        <w:br/>
+      </w:r>
+      <w:hyperlink r:id="rId55">
+        <w:r>
+          <w:rPr>
+            <w:rStyle w:val="Hyperlink"/>
+          </w:rPr>
+          <w:t xml:space="preserve">23f9a94483532f5b7d51f4a27f77436cafd440f30c11fac5e0ea2dfa0aa095ae</w:t>
+        </w:r>
+      </w:hyperlink>
+    </w:p>
+    <w:p>
+      <w:pPr>
+        <w:numPr>
+          <w:ilvl w:val="0"/>
+          <w:numId w:val="1005"/>
+        </w:numPr>
+      </w:pPr>
+      <w:r>
         <w:t xml:space="preserve">Released contrasts:</w:t>
       </w:r>
-    </w:p>
-    <w:bookmarkEnd w:id="35"/>
-    <w:bookmarkStart w:id="37" w:name="app:split"/>
+      <w:r>
+        <w:br/>
+      </w:r>
+      <w:hyperlink r:id="rId56">
+        <w:r>
+          <w:rPr>
+            <w:rStyle w:val="Hyperlink"/>
+          </w:rPr>
+          <w:t xml:space="preserve">d376643af19969f2ee127afcc4696de3a4821c8188fa6e7003d190d5f4031911</w:t>
+        </w:r>
+      </w:hyperlink>
+    </w:p>
+    <w:bookmarkEnd w:id="57"/>
+    <w:bookmarkStart w:id="59" w:name="app:split"/>
     <w:p>
       <w:pPr>
         <w:pStyle w:val="Heading1"/>
@@ -4619,35 +5089,24 @@
         <w:t xml:space="preserve"> </w:t>
       </w:r>
       <w:r>
-        <w:t xml:space="preserve">is the study record: scripts, paper, lock, ledgers, run-card receipts, sealed/released JSON, and Hub</w:t>
-      </w:r>
-      <w:r>
-        <w:t xml:space="preserve"> </w:t>
-      </w:r>
-      <w:r>
-        <w:rPr>
-          <w:i/>
-          <w:iCs/>
-        </w:rPr>
-        <w:t xml:space="preserve">documentation</w:t>
-      </w:r>
-      <w:r>
-        <w:t xml:space="preserve">. Hugging Face</w:t>
-      </w:r>
-      <w:r>
-        <w:t xml:space="preserve"> </w:t>
-      </w:r>
-      <w:r>
-        <w:rPr>
-          <w:rStyle w:val="VerbatimChar"/>
-        </w:rPr>
-        <w:t xml:space="preserve">pageman/nanochat-filipino-p6-m-schedule-topology</w:t>
-      </w:r>
-      <w:r>
-        <w:t xml:space="preserve"> </w:t>
-      </w:r>
-      <w:r>
-        <w:t xml:space="preserve">is the weight deposit: C0+C1+C2+topology children plus tokenizer and evaluation JSON (uploaded; topology children technical recreate). Never a single topology child alone. Never write onto P1.1/P2/P3/P4/P5 Hub IDs. Raw test JSONL, passcodes, SSH keys, optimizer states, and HOST operator cards belong in neither public tree.</w:t>
+        <w:t xml:space="preserve">is the study record: scripts, paper, lock, ledgers, run-card receipts, sealed/released JSON, and Hub documentation. Hugging Face hosts the weight deposit at</w:t>
+      </w:r>
+      <w:r>
+        <w:t xml:space="preserve"> </w:t>
+      </w:r>
+      <w:hyperlink r:id="rId14">
+        <w:r>
+          <w:rPr>
+            <w:rStyle w:val="Hyperlink"/>
+          </w:rPr>
+          <w:t xml:space="preserve">https://huggingface.co/pageman/nanochat-filipino-p6-m-schedule-topology</w:t>
+        </w:r>
+      </w:hyperlink>
+      <w:r>
+        <w:t xml:space="preserve"> </w:t>
+      </w:r>
+      <w:r>
+        <w:t xml:space="preserve">(C0+C1+C2+topology children plus tokenizer and evaluation JSON; uploaded; topology children technical recreate). Never a single topology child alone. Never write onto prior Hub IDs (P1.1, P2, P3, P4, or P5). Raw test JSONL, passcodes, SSH keys, optimizer states, and HOST operator cards belong in neither public tree.</w:t>
       </w:r>
     </w:p>
     <w:p>
@@ -4855,7 +5314,7 @@
       <w:r>
         <w:t xml:space="preserve"> </w:t>
       </w:r>
-      <w:hyperlink r:id="rId36">
+      <w:hyperlink r:id="rId58">
         <w:r>
           <w:rPr>
             <w:rStyle w:val="Hyperlink"/>
@@ -5245,7 +5704,7 @@
         <w:t xml:space="preserve">, 2009.</w:t>
       </w:r>
     </w:p>
-    <w:bookmarkEnd w:id="37"/>
+    <w:bookmarkEnd w:id="59"/>
     <w:sectPr>
       <w:footnotePr>
         <w:numRestart w:val="eachSect"/>
@@ -5472,6 +5931,9 @@
     <w:abstractNumId w:val="991"/>
   </w:num>
   <w:num w:numId="1004">
+    <w:abstractNumId w:val="991"/>
+  </w:num>
+  <w:num w:numId="1005">
     <w:abstractNumId w:val="991"/>
   </w:num>
 </w:numbering>

</xml_diff>